<commit_message>
Bỏ ô "Ca làm việc" khỏi màn Tài xế
Bên Lào không xếp ca — quyết định này chốt từ lúc dựng model và còn ghi nguyên trong
chú thích bảng drivers. Ô ca lọt vào hôm qua vì bản thiết kế giao diện có vẽ nó; anh
chủ dự án bảo bỏ.

Bỏ thì bỏ cả: cột drivers.shift, phép kiểm CA_TX ở API, dữ liệu mẫu, ô chọn trong hộp
hồ sơ, dòng ca trên thẻ xem nhanh và trong ô "rảnh cả ngày" của lịch tuần, năm khoá từ
điển (tx_shift và bốn ca), quy tắc CSS .tx-shift, và chữ "ca" trong mọi câu mô tả —
tab đổi tên từ "Xe & ca làm" thành "Xe thường lái". Để lại một nhãn nhắc tới ca là để
lại một lời hứa mà phần mềm không làm.

Tab đó giờ chỉ còn một ô nên bỏ luôn dòng tiêu đề trong thân tab: tên tab đã nói rồi,
để thêm là người đọc đọc hai lần cùng một câu.

Mười một bộ kiểm và bốn công cụ rà chạy lại sau khi gieo lại dữ liệu: đạt hết, 0 ghi
nhận, bốn ngôn ngữ không lộ khoá.

Co-Authored-By: Claude Opus 5 (1M context) <noreply@anthropic.com>
</commit_message>
<xml_diff>
--- a/DOCS/word/NGHIEP_VU_DB_API.docx
+++ b/DOCS/word/NGHIEP_VU_DB_API.docx
@@ -4392,17 +4392,7 @@
               <w:t>role</w:t>
             </w:r>
             <w:r>
-              <w:t xml:space="preserve">, </w:t>
-            </w:r>
-            <w:r>
-              <w:rPr>
-                <w:rFonts w:ascii="Consolas" w:hAnsi="Consolas"/>
-                <w:sz w:val="19"/>
-              </w:rPr>
-              <w:t>shift</w:t>
-            </w:r>
-            <w:r>
-              <w:t xml:space="preserve"> (ca quen chạy), bằng lái hiện hành (</w:t>
+              <w:t>, bằng lái hiện hành (</w:t>
             </w:r>
             <w:r>
               <w:rPr>

</xml_diff>